<commit_message>
Apply the brand team's template decisions
- The skill now ships the fixed A4 template (D1, D3, D7, D8, D9, as
  approved) plus D4 (Subtitle in Verdana blue) and D6 (copyright line
  in the footer).
- Keep the brand team's original, untouched, in templates/source/;
  `npm run templates` (scripts/make_templates.py) generates the
  official A4 template and the Letter draft from it.
- US Letter draft rebuilt without cropping the covers: the art is
  scaled to the page height, aligned right, and widened with navy.
- documents.md: replace the open-decisions table with the decisions
  log (D2 keep Heading 5, D5 italic quotes, D10 tagline approved),
  and update margins, Subtitle, table, footer, and checklist.
- voice-and-messaging.md: add "The unconventional, delivered."
- README: install by tag with #1.0.0 (the published tag).

Co-Authored-By: Claude Opus 5.5 (1M context) <noreply@anthropic.com>
</commit_message>
<xml_diff>
--- a/drafts/templates/Sngular_Document_Template_Letter.docx
+++ b/drafts/templates/Sngular_Document_Template_Letter.docx
@@ -1552,12 +1552,12 @@
               <wp:anchor allowOverlap="1" behindDoc="0" distB="114300" distT="114300" distL="114300" distR="114300" hidden="0" layoutInCell="1" locked="0" relativeHeight="0" simplePos="0">
                 <wp:simplePos x="0" y="0"/>
                 <wp:positionH relativeFrom="page">
-                  <wp:posOffset>-1424</wp:posOffset>
+                  <wp:posOffset>-1340</wp:posOffset>
                 </wp:positionH>
                 <wp:positionV relativeFrom="page">
-                  <wp:posOffset>-931517</wp:posOffset>
+                  <wp:posOffset>0</wp:posOffset>
                 </wp:positionV>
-                <wp:extent cx="7772400" cy="10992394"/>
+                <wp:extent cx="7772400" cy="10060668"/>
                 <wp:effectExtent b="0" l="0" r="0" t="0"/>
                 <wp:wrapNone/>
                 <wp:docPr id="1" name=""/>
@@ -1568,7 +1568,7 @@
                       <wpg:grpSpPr>
                         <a:xfrm>
                           <a:off x="0" y="0"/>
-                          <a:ext cx="7772400" cy="10992394"/>
+                          <a:ext cx="7772400" cy="10060668"/>
                           <a:chOff x="0" y="0"/>
                           <a:chExt cx="6096000" cy="8839225"/>
                         </a:xfrm>
@@ -1716,12 +1716,12 @@
               <wp:anchor allowOverlap="1" behindDoc="0" distB="114300" distT="114300" distL="114300" distR="114300" hidden="0" layoutInCell="1" locked="0" relativeHeight="0" simplePos="0">
                 <wp:simplePos x="0" y="0"/>
                 <wp:positionH relativeFrom="page">
-                  <wp:posOffset>-1424</wp:posOffset>
+                  <wp:posOffset>-1340</wp:posOffset>
                 </wp:positionH>
                 <wp:positionV relativeFrom="page">
-                  <wp:posOffset>-931517</wp:posOffset>
+                  <wp:posOffset>0</wp:posOffset>
                 </wp:positionV>
-                <wp:extent cx="7772400" cy="10992394"/>
+                <wp:extent cx="7772400" cy="10060668"/>
                 <wp:effectExtent b="0" l="0" r="0" t="0"/>
                 <wp:wrapNone/>
                 <wp:docPr id="1" name="image4.png"/>
@@ -1742,7 +1742,7 @@
                       <pic:spPr>
                         <a:xfrm>
                           <a:off x="0" y="0"/>
-                          <a:ext cx="7772400" cy="10992394"/>
+                          <a:ext cx="7772400" cy="10060668"/>
                         </a:xfrm>
                         <a:prstGeom prst="rect"/>
                         <a:ln/>
@@ -1779,12 +1779,32 @@
 <w:ftr xmlns:mc="http://schemas.openxmlformats.org/markup-compatibility/2006" xmlns:o="urn:schemas-microsoft-com:office:office" xmlns:r="http://schemas.openxmlformats.org/officeDocument/2006/relationships" xmlns:m="http://schemas.openxmlformats.org/officeDocument/2006/math" xmlns:v="urn:schemas-microsoft-com:vml" xmlns:wp="http://schemas.openxmlformats.org/drawingml/2006/wordprocessingDrawing" xmlns:w10="urn:schemas-microsoft-com:office:word" xmlns:w="http://schemas.openxmlformats.org/wordprocessingml/2006/main" xmlns:wne="http://schemas.microsoft.com/office/word/2006/wordml" xmlns:sl="http://schemas.openxmlformats.org/schemaLibrary/2006/main" xmlns:a="http://schemas.openxmlformats.org/drawingml/2006/main" xmlns:pic="http://schemas.openxmlformats.org/drawingml/2006/picture" xmlns:c="http://schemas.openxmlformats.org/drawingml/2006/chart" xmlns:lc="http://schemas.openxmlformats.org/drawingml/2006/lockedCanvas" xmlns:dgm="http://schemas.openxmlformats.org/drawingml/2006/diagram" xmlns:wps="http://schemas.microsoft.com/office/word/2010/wordprocessingShape" xmlns:wpg="http://schemas.microsoft.com/office/word/2010/wordprocessingGroup" xmlns:w14="http://schemas.microsoft.com/office/word/2010/wordml" xmlns:w15="http://schemas.microsoft.com/office/word/2012/wordml" xmlns:w16="http://schemas.microsoft.com/office/word/2018/wordml" xmlns:w16cex="http://schemas.microsoft.com/office/word/2018/wordml/cex" xmlns:w16cid="http://schemas.microsoft.com/office/word/2016/wordml/cid" xmlns="http://schemas.microsoft.com/office/tasks/2019/documenttasks" xmlns:cr="http://schemas.microsoft.com/office/comments/2020/reactions">
   <w:p>
     <w:pPr>
-      <w:ind w:left="714" w:right="-47" w:firstLine="425"/>
-      <w:jc w:val="right"/>
+      <w:tabs>
+        <w:tab w:val="right" w:pos="10198"/>
+      </w:tabs>
+      <w:ind w:left="0" w:right="0" w:firstLine="0"/>
+      <w:jc w:val="left"/>
       <w:rPr/>
     </w:pPr>
     <w:r>
-      <w:rPr/>
+      <w:rPr>
+        <w:sz w:val="16"/>
+        <w:szCs w:val="16"/>
+      </w:rPr>
+      <w:t xml:space="preserve">Copyright © Sngular. All rights reserved.</w:t>
+    </w:r>
+    <w:r>
+      <w:rPr>
+        <w:sz w:val="16"/>
+        <w:szCs w:val="16"/>
+      </w:rPr>
+      <w:tab/>
+    </w:r>
+    <w:r>
+      <w:rPr>
+        <w:sz w:val="16"/>
+        <w:szCs w:val="16"/>
+      </w:rPr>
       <w:fldChar w:fldCharType="begin"/>
       <w:instrText xml:space="preserve">PAGE</w:instrText>
       <w:fldChar w:fldCharType="separate"/>
@@ -1908,9 +1928,9 @@
                 <wp:posOffset>0</wp:posOffset>
               </wp:positionH>
               <wp:positionV relativeFrom="page">
-                <wp:posOffset>-931517</wp:posOffset>
+                <wp:posOffset>0</wp:posOffset>
               </wp:positionV>
-              <wp:extent cx="7772400" cy="11335259"/>
+              <wp:extent cx="7772400" cy="10374471"/>
               <wp:effectExtent b="0" l="0" r="0" t="0"/>
               <wp:wrapNone/>
               <wp:docPr id="2" name=""/>
@@ -1921,7 +1941,7 @@
                     <wpg:grpSpPr>
                       <a:xfrm>
                         <a:off x="0" y="0"/>
-                        <a:ext cx="7772400" cy="11335259"/>
+                        <a:ext cx="7772400" cy="10374471"/>
                         <a:chOff x="0" y="0"/>
                         <a:chExt cx="6055275" cy="8839225"/>
                       </a:xfrm>
@@ -2084,9 +2104,9 @@
                 <wp:posOffset>0</wp:posOffset>
               </wp:positionH>
               <wp:positionV relativeFrom="page">
-                <wp:posOffset>-931517</wp:posOffset>
+                <wp:posOffset>0</wp:posOffset>
               </wp:positionV>
-              <wp:extent cx="7772400" cy="11335259"/>
+              <wp:extent cx="7772400" cy="10374471"/>
               <wp:effectExtent b="0" l="0" r="0" t="0"/>
               <wp:wrapNone/>
               <wp:docPr id="2" name="image5.png"/>
@@ -2107,7 +2127,7 @@
                     <pic:spPr>
                       <a:xfrm>
                         <a:off x="0" y="0"/>
-                        <a:ext cx="7772400" cy="11335259"/>
+                        <a:ext cx="7772400" cy="10374471"/>
                       </a:xfrm>
                       <a:prstGeom prst="rect"/>
                       <a:ln/>
@@ -2132,10 +2152,10 @@
             <wp:anchor allowOverlap="1" behindDoc="1" distB="114300" distT="114300" distL="114300" distR="114300" hidden="0" layoutInCell="1" locked="0" relativeHeight="0" simplePos="0">
               <wp:simplePos x="0" y="0"/>
               <wp:positionH relativeFrom="column">
-                <wp:posOffset>1085215</wp:posOffset>
+                <wp:posOffset>1641651</wp:posOffset>
               </wp:positionH>
               <wp:positionV relativeFrom="paragraph">
-                <wp:posOffset>3424882</wp:posOffset>
+                <wp:posOffset>3965887</wp:posOffset>
               </wp:positionV>
               <wp:extent cx="5238750" cy="914400"/>
               <wp:effectExtent b="0" l="0" r="0" t="0"/>
@@ -2198,10 +2218,10 @@
             <wp:anchor allowOverlap="1" behindDoc="1" distB="114300" distT="114300" distL="114300" distR="114300" hidden="0" layoutInCell="1" locked="0" relativeHeight="0" simplePos="0">
               <wp:simplePos x="0" y="0"/>
               <wp:positionH relativeFrom="column">
-                <wp:posOffset>1085215</wp:posOffset>
+                <wp:posOffset>1641651</wp:posOffset>
               </wp:positionH>
               <wp:positionV relativeFrom="paragraph">
-                <wp:posOffset>3424882</wp:posOffset>
+                <wp:posOffset>3965887</wp:posOffset>
               </wp:positionV>
               <wp:extent cx="5238750" cy="914400"/>
               <wp:effectExtent b="0" l="0" r="0" t="0"/>
@@ -2502,10 +2522,10 @@
       <w:spacing w:after="320" w:before="0" w:lineRule="auto"/>
     </w:pPr>
     <w:rPr>
-      <w:rFonts w:ascii="Arial" w:cs="Arial" w:eastAsia="Arial" w:hAnsi="Arial"/>
+      <w:rFonts w:ascii="Verdana" w:cs="Verdana" w:eastAsia="Verdana" w:hAnsi="Verdana"/>
       <w:i w:val="0"/>
       <w:iCs w:val="0"/>
-      <w:color w:val="666666"/>
+      <w:color w:val="0070F6"/>
       <w:sz w:val="30"/>
       <w:szCs w:val="30"/>
     </w:rPr>

</xml_diff>

<commit_message>
Fit the cover and back cover without distortion; release 1.1.0
- D12: the full-page artwork keeps its proportions and covers the page
  from the top-left corner. The brand original stretched the back cover
  (art and S|) 2.5% wide and overscaled the cover 3%; both groups now
  use a 1:1 transform, and the art's 1 px frame (a light hairline on the
  page edge) is removed.
- The US Letter draft builds on the same fit; its S| is no longer
  stretched 9-12%.
- documents.md: add D12 and the rule for building A4 templates.
- Bump to 1.1.0 and rebuild dist/sngular-design.skill.

Co-Authored-By: Claude Opus 5.5 <noreply@anthropic.com>
</commit_message>
<xml_diff>
--- a/drafts/templates/Sngular_Document_Template_Letter.docx
+++ b/drafts/templates/Sngular_Document_Template_Letter.docx
@@ -1552,12 +1552,12 @@
               <wp:anchor allowOverlap="1" behindDoc="0" distB="114300" distT="114300" distL="114300" distR="114300" hidden="0" layoutInCell="1" locked="0" relativeHeight="0" simplePos="0">
                 <wp:simplePos x="0" y="0"/>
                 <wp:positionH relativeFrom="page">
-                  <wp:posOffset>-1340</wp:posOffset>
+                  <wp:posOffset>0</wp:posOffset>
                 </wp:positionH>
                 <wp:positionV relativeFrom="page">
                   <wp:posOffset>0</wp:posOffset>
                 </wp:positionV>
-                <wp:extent cx="7772400" cy="10060668"/>
+                <wp:extent cx="7772400" cy="10064128"/>
                 <wp:effectExtent b="0" l="0" r="0" t="0"/>
                 <wp:wrapNone/>
                 <wp:docPr id="1" name=""/>
@@ -1568,9 +1568,9 @@
                       <wpg:grpSpPr>
                         <a:xfrm>
                           <a:off x="0" y="0"/>
-                          <a:ext cx="7772400" cy="10060668"/>
+                          <a:ext cx="7772400" cy="10064128"/>
                           <a:chOff x="0" y="0"/>
-                          <a:chExt cx="6096000" cy="8839225"/>
+                          <a:chExt cx="7772400" cy="10064128"/>
                         </a:xfrm>
                       </wpg:grpSpPr>
                       <pic:pic>
@@ -1588,8 +1588,8 @@
                         </pic:blipFill>
                         <pic:spPr>
                           <a:xfrm>
-                            <a:off x="-153625" y="0"/>
-                            <a:ext cx="6249622" cy="8839200"/>
+                            <a:off x="0" y="0"/>
+                            <a:ext cx="7772400" cy="10064128"/>
                           </a:xfrm>
                           <a:prstGeom prst="rect">
                             <a:avLst/>
@@ -1615,8 +1615,8 @@
                         </pic:blipFill>
                         <pic:spPr>
                           <a:xfrm>
-                            <a:off x="1427179" y="4003163"/>
-                            <a:ext cx="532125" cy="832875"/>
+                            <a:off x="2337437" y="4556337"/>
+                            <a:ext cx="605644" cy="947966"/>
                           </a:xfrm>
                           <a:prstGeom prst="rect">
                             <a:avLst/>
@@ -1632,8 +1632,8 @@
                         <wps:cNvPr id="4" name="Shape 4"/>
                         <wps:spPr>
                           <a:xfrm>
-                            <a:off x="1959300" y="4003175"/>
-                            <a:ext cx="2694600" cy="772800"/>
+                            <a:off x="2943078" y="4556351"/>
+                            <a:ext cx="3144408" cy="879589"/>
                           </a:xfrm>
                           <a:prstGeom prst="rect">
                             <a:avLst/>
@@ -1716,12 +1716,12 @@
               <wp:anchor allowOverlap="1" behindDoc="0" distB="114300" distT="114300" distL="114300" distR="114300" hidden="0" layoutInCell="1" locked="0" relativeHeight="0" simplePos="0">
                 <wp:simplePos x="0" y="0"/>
                 <wp:positionH relativeFrom="page">
-                  <wp:posOffset>-1340</wp:posOffset>
+                  <wp:posOffset>0</wp:posOffset>
                 </wp:positionH>
                 <wp:positionV relativeFrom="page">
                   <wp:posOffset>0</wp:posOffset>
                 </wp:positionV>
-                <wp:extent cx="7772400" cy="10060668"/>
+                <wp:extent cx="7772400" cy="10064128"/>
                 <wp:effectExtent b="0" l="0" r="0" t="0"/>
                 <wp:wrapNone/>
                 <wp:docPr id="1" name="image4.png"/>
@@ -1742,7 +1742,7 @@
                       <pic:spPr>
                         <a:xfrm>
                           <a:off x="0" y="0"/>
-                          <a:ext cx="7772400" cy="10060668"/>
+                          <a:ext cx="7772400" cy="10064128"/>
                         </a:xfrm>
                         <a:prstGeom prst="rect"/>
                         <a:ln/>
@@ -1930,7 +1930,7 @@
               <wp:positionV relativeFrom="page">
                 <wp:posOffset>0</wp:posOffset>
               </wp:positionV>
-              <wp:extent cx="7772400" cy="10374471"/>
+              <wp:extent cx="7772400" cy="10064128"/>
               <wp:effectExtent b="0" l="0" r="0" t="0"/>
               <wp:wrapNone/>
               <wp:docPr id="2" name=""/>
@@ -1941,9 +1941,9 @@
                     <wpg:grpSpPr>
                       <a:xfrm>
                         <a:off x="0" y="0"/>
-                        <a:ext cx="7772400" cy="10374471"/>
+                        <a:ext cx="7772400" cy="10064128"/>
                         <a:chOff x="0" y="0"/>
-                        <a:chExt cx="6055275" cy="8839225"/>
+                        <a:chExt cx="7772400" cy="10064128"/>
                       </a:xfrm>
                     </wpg:grpSpPr>
                     <pic:pic>
@@ -1961,8 +1961,8 @@
                       </pic:blipFill>
                       <pic:spPr>
                         <a:xfrm>
-                          <a:off x="-194350" y="0"/>
-                          <a:ext cx="6249622" cy="8839200"/>
+                          <a:off x="0" y="0"/>
+                          <a:ext cx="7772400" cy="10064128"/>
                         </a:xfrm>
                         <a:prstGeom prst="rect">
                           <a:avLst/>
@@ -1988,8 +1988,8 @@
                       </pic:blipFill>
                       <pic:spPr>
                         <a:xfrm>
-                          <a:off x="629999" y="3896925"/>
-                          <a:ext cx="667850" cy="1045350"/>
+                          <a:off x="1397535" y="4573765"/>
+                          <a:ext cx="783861" cy="1226912"/>
                         </a:xfrm>
                         <a:prstGeom prst="rect">
                           <a:avLst/>
@@ -2005,8 +2005,8 @@
                       <wps:cNvPr id="7" name="Shape 7"/>
                       <wps:spPr>
                         <a:xfrm>
-                          <a:off x="1297850" y="3896925"/>
-                          <a:ext cx="3725100" cy="1045500"/>
+                          <a:off x="2181397" y="4573765"/>
+                          <a:ext cx="4376166" cy="1227088"/>
                         </a:xfrm>
                         <a:prstGeom prst="rect">
                           <a:avLst/>
@@ -2050,8 +2050,8 @@
                       <wps:cNvPr id="8" name="Shape 8"/>
                       <wps:spPr>
                         <a:xfrm>
-                          <a:off x="514150" y="7434175"/>
-                          <a:ext cx="3725100" cy="277200"/>
+                          <a:off x="1260724" y="8725384"/>
+                          <a:ext cx="4376166" cy="325346"/>
                         </a:xfrm>
                         <a:prstGeom prst="rect">
                           <a:avLst/>
@@ -2106,7 +2106,7 @@
               <wp:positionV relativeFrom="page">
                 <wp:posOffset>0</wp:posOffset>
               </wp:positionV>
-              <wp:extent cx="7772400" cy="10374471"/>
+              <wp:extent cx="7772400" cy="10064128"/>
               <wp:effectExtent b="0" l="0" r="0" t="0"/>
               <wp:wrapNone/>
               <wp:docPr id="2" name="image5.png"/>
@@ -2127,7 +2127,7 @@
                     <pic:spPr>
                       <a:xfrm>
                         <a:off x="0" y="0"/>
-                        <a:ext cx="7772400" cy="10374471"/>
+                        <a:ext cx="7772400" cy="10064128"/>
                       </a:xfrm>
                       <a:prstGeom prst="rect"/>
                       <a:ln/>
@@ -2152,7 +2152,7 @@
             <wp:anchor allowOverlap="1" behindDoc="1" distB="114300" distT="114300" distL="114300" distR="114300" hidden="0" layoutInCell="1" locked="0" relativeHeight="0" simplePos="0">
               <wp:simplePos x="0" y="0"/>
               <wp:positionH relativeFrom="column">
-                <wp:posOffset>1641651</wp:posOffset>
+                <wp:posOffset>1639566</wp:posOffset>
               </wp:positionH>
               <wp:positionV relativeFrom="paragraph">
                 <wp:posOffset>3965887</wp:posOffset>
@@ -2218,7 +2218,7 @@
             <wp:anchor allowOverlap="1" behindDoc="1" distB="114300" distT="114300" distL="114300" distR="114300" hidden="0" layoutInCell="1" locked="0" relativeHeight="0" simplePos="0">
               <wp:simplePos x="0" y="0"/>
               <wp:positionH relativeFrom="column">
-                <wp:posOffset>1641651</wp:posOffset>
+                <wp:posOffset>1639566</wp:posOffset>
               </wp:positionH>
               <wp:positionV relativeFrom="paragraph">
                 <wp:posOffset>3965887</wp:posOffset>

</xml_diff>